<commit_message>
docs: remove líder do grupo
Co-Authored-By: Claude Sonnet 5.5 <noreply@anthropic.com>
Claude-Session: https://claude.ai/code/session_01MtSjhk9K5i4x5r8xkvM9Pf
</commit_message>
<xml_diff>
--- a/docs/DOCUMENTACAO_CONECTFOME.docx
+++ b/docs/DOCUMENTACAO_CONECTFOME.docx
@@ -104,7 +104,7 @@
           <w:sz w:val="22"/>
           <w:szCs w:val="22"/>
         </w:rPr>
-        <w:t xml:space="preserve">João Albuquerque de Meneses (RA 252930) – Líder</w:t>
+        <w:t xml:space="preserve">João Albuquerque de Meneses (RA 252930)</w:t>
       </w:r>
     </w:p>
     <w:p>
@@ -374,7 +374,7 @@
           <w:szCs w:val="22"/>
         </w:rPr>
         <w:tab/>
-        <w:t xml:space="preserve">5</w:t>
+        <w:t xml:space="preserve">4</w:t>
       </w:r>
     </w:p>
     <w:p>
@@ -402,7 +402,7 @@
           <w:szCs w:val="22"/>
         </w:rPr>
         <w:tab/>
-        <w:t xml:space="preserve">6</w:t>
+        <w:t xml:space="preserve">5</w:t>
       </w:r>
     </w:p>
     <w:p>
@@ -654,7 +654,7 @@
           <w:szCs w:val="20"/>
         </w:rPr>
         <w:tab/>
-        <w:t xml:space="preserve">11</w:t>
+        <w:t xml:space="preserve">10</w:t>
       </w:r>
     </w:p>
     <w:p>
@@ -1733,78 +1733,6 @@
                 <w:szCs w:val="20"/>
               </w:rPr>
               <w:t xml:space="preserve">Brenda Medina de Oliveira</w:t>
-            </w:r>
-          </w:p>
-        </w:tc>
-      </w:tr>
-      <w:tr>
-        <w:trPr>
-          <w:cantSplit/>
-        </w:trPr>
-        <w:tc>
-          <w:tcPr>
-            <w:tcW w:type="dxa" w:w="2400"/>
-            <w:tcBorders>
-              <w:top w:val="single" w:color="C9D1D9" w:sz="4"/>
-              <w:left w:val="single" w:color="C9D1D9" w:sz="4"/>
-              <w:bottom w:val="single" w:color="C9D1D9" w:sz="4"/>
-              <w:right w:val="single" w:color="C9D1D9" w:sz="4"/>
-            </w:tcBorders>
-            <w:shd w:fill="E7F4EE" w:color="auto" w:val="clear"/>
-            <w:tcMar>
-              <w:top w:type="dxa" w:w="70"/>
-              <w:left w:type="dxa" w:w="110"/>
-              <w:bottom w:type="dxa" w:w="70"/>
-              <w:right w:type="dxa" w:w="110"/>
-            </w:tcMar>
-            <w:vAlign w:val="top"/>
-          </w:tcPr>
-          <w:p>
-            <w:pPr>
-              <w:spacing w:after="40" w:line="276"/>
-              <w:jc w:val="left"/>
-            </w:pPr>
-            <w:r>
-              <w:rPr>
-                <w:rFonts w:ascii="Arial" w:cs="Arial" w:eastAsia="Arial" w:hAnsi="Arial"/>
-                <w:b/>
-                <w:bCs/>
-                <w:sz w:val="20"/>
-                <w:szCs w:val="20"/>
-              </w:rPr>
-              <w:t xml:space="preserve">Líder do grupo</w:t>
-            </w:r>
-          </w:p>
-        </w:tc>
-        <w:tc>
-          <w:tcPr>
-            <w:tcW w:type="dxa" w:w="6671"/>
-            <w:tcBorders>
-              <w:top w:val="single" w:color="C9D1D9" w:sz="4"/>
-              <w:left w:val="single" w:color="C9D1D9" w:sz="4"/>
-              <w:bottom w:val="single" w:color="C9D1D9" w:sz="4"/>
-              <w:right w:val="single" w:color="C9D1D9" w:sz="4"/>
-            </w:tcBorders>
-            <w:tcMar>
-              <w:top w:type="dxa" w:w="70"/>
-              <w:left w:type="dxa" w:w="110"/>
-              <w:bottom w:type="dxa" w:w="70"/>
-              <w:right w:type="dxa" w:w="110"/>
-            </w:tcMar>
-            <w:vAlign w:val="top"/>
-          </w:tcPr>
-          <w:p>
-            <w:pPr>
-              <w:spacing w:after="40" w:line="276"/>
-              <w:jc w:val="left"/>
-            </w:pPr>
-            <w:r>
-              <w:rPr>
-                <w:rFonts w:ascii="Arial" w:cs="Arial" w:eastAsia="Arial" w:hAnsi="Arial"/>
-                <w:sz w:val="20"/>
-                <w:szCs w:val="20"/>
-              </w:rPr>
-              <w:t xml:space="preserve">João Albuquerque de Meneses</w:t>
             </w:r>
           </w:p>
         </w:tc>
@@ -7299,7 +7227,7 @@
                 <w:sz w:val="20"/>
                 <w:szCs w:val="20"/>
               </w:rPr>
-              <w:t xml:space="preserve">Líder do projeto, Product Owner (PO), levantamento e organização de requisitos</w:t>
+              <w:t xml:space="preserve">Product Owner (PO), levantamento e organização de requisitos</w:t>
             </w:r>
           </w:p>
         </w:tc>

</xml_diff>